<commit_message>
ref: updating resume and adding another project
</commit_message>
<xml_diff>
--- a/src/resources/documents/resume.docx
+++ b/src/resources/documents/resume.docx
@@ -59,7 +59,7 @@
         </w:rPr>
         <w:t xml:space="preserve">| </w:t>
       </w:r>
-      <w:hyperlink r:id="R8028960fde6542e0">
+      <w:hyperlink r:id="R2a4ca810b6644bea">
         <w:r>
           <w:rPr>
             <w:rStyle w:val="Hyperlink"/>
@@ -80,7 +80,7 @@
         </w:rPr>
         <w:t xml:space="preserve"> | </w:t>
       </w:r>
-      <w:hyperlink r:id="R771a41980cb5470b">
+      <w:hyperlink r:id="R102421dbf13a4310">
         <w:r>
           <w:rPr>
             <w:rStyle w:val="Hyperlink"/>
@@ -110,7 +110,7 @@
         </w:rPr>
         <w:t xml:space="preserve"> </w:t>
       </w:r>
-      <w:hyperlink r:id="R95000b2caf1d4f7c">
+      <w:hyperlink r:id="Ree91cf95147c4bc2">
         <w:r>
           <w:rPr>
             <w:rStyle w:val="Hyperlink"/>
@@ -1130,6 +1130,16 @@
         </w:rPr>
         <w:t>customizable swipe gesture actions</w:t>
       </w:r>
+      <w:r>
+        <w:rPr>
+          <w:rFonts w:ascii="Arial" w:hAnsi="Arial" w:eastAsia="Arial" w:cs="Arial"/>
+          <w:noProof w:val="0"/>
+          <w:sz w:val="21"/>
+          <w:szCs w:val="21"/>
+          <w:lang w:val="en-GB"/>
+        </w:rPr>
+        <w:t>.</w:t>
+      </w:r>
     </w:p>
     <w:p>
       <w:pPr>
@@ -1174,6 +1184,16 @@
         </w:rPr>
         <w:t>navigation and UX improvements</w:t>
       </w:r>
+      <w:r>
+        <w:rPr>
+          <w:rFonts w:ascii="Arial" w:hAnsi="Arial" w:eastAsia="Arial" w:cs="Arial"/>
+          <w:noProof w:val="0"/>
+          <w:sz w:val="21"/>
+          <w:szCs w:val="21"/>
+          <w:lang w:val="en-GB"/>
+        </w:rPr>
+        <w:t>.</w:t>
+      </w:r>
     </w:p>
     <w:p>
       <w:pPr>
@@ -1239,6 +1259,16 @@
           <w:lang w:val="en-GB"/>
         </w:rPr>
         <w:t xml:space="preserve"> standards</w:t>
+      </w:r>
+      <w:r>
+        <w:rPr>
+          <w:rFonts w:ascii="Arial" w:hAnsi="Arial" w:eastAsia="Arial" w:cs="Arial"/>
+          <w:noProof w:val="0"/>
+          <w:sz w:val="21"/>
+          <w:szCs w:val="21"/>
+          <w:lang w:val="en-GB"/>
+        </w:rPr>
+        <w:t>.</w:t>
       </w:r>
     </w:p>
     <w:p>
@@ -1406,6 +1436,16 @@
         </w:rPr>
         <w:t>a monolithic backend using Spring Boot</w:t>
       </w:r>
+      <w:r>
+        <w:rPr>
+          <w:rFonts w:ascii="Arial" w:hAnsi="Arial" w:eastAsia="Arial" w:cs="Arial"/>
+          <w:noProof w:val="0"/>
+          <w:sz w:val="21"/>
+          <w:szCs w:val="21"/>
+          <w:lang w:val="en-GB"/>
+        </w:rPr>
+        <w:t>.</w:t>
+      </w:r>
     </w:p>
     <w:p>
       <w:pPr>
@@ -1466,6 +1506,18 @@
         </w:rPr>
         <w:t>OAuth2, JWT, and RBAC</w:t>
       </w:r>
+      <w:r>
+        <w:rPr>
+          <w:rFonts w:ascii="Arial" w:hAnsi="Arial" w:eastAsia="Arial" w:cs="Arial"/>
+          <w:b w:val="0"/>
+          <w:bCs w:val="0"/>
+          <w:noProof w:val="0"/>
+          <w:sz w:val="21"/>
+          <w:szCs w:val="21"/>
+          <w:lang w:val="en-GB"/>
+        </w:rPr>
+        <w:t>.</w:t>
+      </w:r>
     </w:p>
     <w:p>
       <w:pPr>
@@ -1509,6 +1561,16 @@
           <w:lang w:val="en-GB"/>
         </w:rPr>
         <w:t>the application using Docker Compose</w:t>
+      </w:r>
+      <w:r>
+        <w:rPr>
+          <w:rFonts w:ascii="Arial" w:hAnsi="Arial" w:eastAsia="Arial" w:cs="Arial"/>
+          <w:noProof w:val="0"/>
+          <w:sz w:val="21"/>
+          <w:szCs w:val="21"/>
+          <w:lang w:val="en-GB"/>
+        </w:rPr>
+        <w:t>.</w:t>
       </w:r>
     </w:p>
     <w:p>
@@ -1609,6 +1671,16 @@
         </w:rPr>
         <w:t>Built with React and TypeScript</w:t>
       </w:r>
+      <w:r>
+        <w:rPr>
+          <w:rFonts w:ascii="Arial" w:hAnsi="Arial" w:eastAsia="Arial" w:cs="Arial"/>
+          <w:noProof w:val="0"/>
+          <w:sz w:val="21"/>
+          <w:szCs w:val="21"/>
+          <w:lang w:val="en-GB"/>
+        </w:rPr>
+        <w:t>.</w:t>
+      </w:r>
     </w:p>
     <w:p>
       <w:pPr>
@@ -1640,6 +1712,16 @@
           <w:lang w:val="en-GB"/>
         </w:rPr>
         <w:t>Includes project demos and videos</w:t>
+      </w:r>
+      <w:r>
+        <w:rPr>
+          <w:rFonts w:ascii="Arial" w:hAnsi="Arial" w:eastAsia="Arial" w:cs="Arial"/>
+          <w:noProof w:val="0"/>
+          <w:sz w:val="21"/>
+          <w:szCs w:val="21"/>
+          <w:lang w:val="en-GB"/>
+        </w:rPr>
+        <w:t>.</w:t>
       </w:r>
     </w:p>
     <w:p>

</xml_diff>